<commit_message>
Fill interference results table with actual measured values
</commit_message>
<xml_diff>
--- a/ENCS5323_Report_updated.docx
+++ b/ENCS5323_Report_updated.docx
@@ -3029,21 +3029,8 @@
             <w:tcW w:w="1625" w:type="dxa"/>
           </w:tcPr>
           <w:p>
-            <w:pPr>
-              <w:pStyle w:val="10"/>
-              <w:ind w:left="16"/>
-              <w:rPr>
-                <w:b/>
-                <w:sz w:val="22"/>
-              </w:rPr>
-            </w:pPr>
             <w:r>
-              <w:rPr>
-                <w:b/>
-                <w:spacing w:val="-2"/>
-                <w:sz w:val="22"/>
-              </w:rPr>
-              <w:t>74.8%</w:t>
+              <w:t>74.75%</w:t>
             </w:r>
           </w:p>
         </w:tc>
@@ -3052,31 +3039,8 @@
             <w:tcW w:w="1037" w:type="dxa"/>
           </w:tcPr>
           <w:p>
-            <w:pPr>
-              <w:pStyle w:val="10"/>
-              <w:rPr>
-                <w:sz w:val="22"/>
-              </w:rPr>
-            </w:pPr>
             <w:r>
-              <w:rPr>
-                <w:sz w:val="22"/>
-              </w:rPr>
-              <w:t>~X</w:t>
-            </w:r>
-            <w:r>
-              <w:rPr>
-                <w:spacing w:val="-1"/>
-                <w:sz w:val="22"/>
-              </w:rPr>
-              <w:t xml:space="preserve"> </w:t>
-            </w:r>
-            <w:r>
-              <w:rPr>
-                <w:spacing w:val="-5"/>
-                <w:sz w:val="22"/>
-              </w:rPr>
-              <w:t>ms</w:t>
+              <w:t>115.0 ms</w:t>
             </w:r>
           </w:p>
         </w:tc>
@@ -3085,42 +3049,8 @@
             <w:tcW w:w="1625" w:type="dxa"/>
           </w:tcPr>
           <w:p>
-            <w:pPr>
-              <w:pStyle w:val="10"/>
-              <w:spacing w:before="97"/>
-              <w:rPr>
-                <w:sz w:val="22"/>
-              </w:rPr>
-            </w:pPr>
             <w:r>
-              <w:rPr>
-                <w:spacing w:val="-2"/>
-                <w:sz w:val="22"/>
-              </w:rPr>
-              <w:t>~X+80–</w:t>
-            </w:r>
-            <w:r>
-              <w:rPr>
-                <w:spacing w:val="-5"/>
-                <w:sz w:val="22"/>
-              </w:rPr>
-              <w:t>180</w:t>
-            </w:r>
-          </w:p>
-          <w:p>
-            <w:pPr>
-              <w:pStyle w:val="10"/>
-              <w:spacing w:before="44"/>
-              <w:rPr>
-                <w:sz w:val="22"/>
-              </w:rPr>
-            </w:pPr>
-            <w:r>
-              <w:rPr>
-                <w:spacing w:val="-5"/>
-                <w:sz w:val="22"/>
-              </w:rPr>
-              <w:t>ms</w:t>
+              <w:t>179.5 ms</w:t>
             </w:r>
           </w:p>
         </w:tc>
@@ -3246,21 +3176,8 @@
             <w:tcW w:w="1625" w:type="dxa"/>
           </w:tcPr>
           <w:p>
-            <w:pPr>
-              <w:pStyle w:val="10"/>
-              <w:ind w:left="16"/>
-              <w:rPr>
-                <w:b/>
-                <w:sz w:val="22"/>
-              </w:rPr>
-            </w:pPr>
             <w:r>
-              <w:rPr>
-                <w:b/>
-                <w:spacing w:val="-2"/>
-                <w:sz w:val="22"/>
-              </w:rPr>
-              <w:t>83.2%</w:t>
+              <w:t>83.25%</w:t>
             </w:r>
           </w:p>
         </w:tc>
@@ -3269,31 +3186,8 @@
             <w:tcW w:w="1037" w:type="dxa"/>
           </w:tcPr>
           <w:p>
-            <w:pPr>
-              <w:pStyle w:val="10"/>
-              <w:rPr>
-                <w:sz w:val="22"/>
-              </w:rPr>
-            </w:pPr>
             <w:r>
-              <w:rPr>
-                <w:sz w:val="22"/>
-              </w:rPr>
-              <w:t>~X</w:t>
-            </w:r>
-            <w:r>
-              <w:rPr>
-                <w:spacing w:val="-1"/>
-                <w:sz w:val="22"/>
-              </w:rPr>
-              <w:t xml:space="preserve"> </w:t>
-            </w:r>
-            <w:r>
-              <w:rPr>
-                <w:spacing w:val="-5"/>
-                <w:sz w:val="22"/>
-              </w:rPr>
-              <w:t>ms</w:t>
+              <w:t>82.0 ms</w:t>
             </w:r>
           </w:p>
         </w:tc>
@@ -3302,42 +3196,8 @@
             <w:tcW w:w="1625" w:type="dxa"/>
           </w:tcPr>
           <w:p>
-            <w:pPr>
-              <w:pStyle w:val="10"/>
-              <w:spacing w:before="97"/>
-              <w:rPr>
-                <w:sz w:val="22"/>
-              </w:rPr>
-            </w:pPr>
             <w:r>
-              <w:rPr>
-                <w:spacing w:val="-2"/>
-                <w:sz w:val="22"/>
-              </w:rPr>
-              <w:t>~X+80–</w:t>
-            </w:r>
-            <w:r>
-              <w:rPr>
-                <w:spacing w:val="-5"/>
-                <w:sz w:val="22"/>
-              </w:rPr>
-              <w:t>180</w:t>
-            </w:r>
-          </w:p>
-          <w:p>
-            <w:pPr>
-              <w:pStyle w:val="10"/>
-              <w:spacing w:before="44"/>
-              <w:rPr>
-                <w:sz w:val="22"/>
-              </w:rPr>
-            </w:pPr>
-            <w:r>
-              <w:rPr>
-                <w:spacing w:val="-5"/>
-                <w:sz w:val="22"/>
-              </w:rPr>
-              <w:t>ms</w:t>
+              <w:t>155.0 ms</w:t>
             </w:r>
           </w:p>
         </w:tc>
@@ -3483,21 +3343,8 @@
             <w:tcW w:w="1625" w:type="dxa"/>
           </w:tcPr>
           <w:p>
-            <w:pPr>
-              <w:pStyle w:val="10"/>
-              <w:ind w:left="16"/>
-              <w:rPr>
-                <w:b/>
-                <w:sz w:val="22"/>
-              </w:rPr>
-            </w:pPr>
             <w:r>
-              <w:rPr>
-                <w:b/>
-                <w:spacing w:val="-2"/>
-                <w:sz w:val="22"/>
-              </w:rPr>
-              <w:t>83.2%</w:t>
+              <w:t>83.25%</w:t>
             </w:r>
           </w:p>
         </w:tc>
@@ -3506,31 +3353,8 @@
             <w:tcW w:w="1037" w:type="dxa"/>
           </w:tcPr>
           <w:p>
-            <w:pPr>
-              <w:pStyle w:val="10"/>
-              <w:rPr>
-                <w:sz w:val="22"/>
-              </w:rPr>
-            </w:pPr>
             <w:r>
-              <w:rPr>
-                <w:sz w:val="22"/>
-              </w:rPr>
-              <w:t>~X</w:t>
-            </w:r>
-            <w:r>
-              <w:rPr>
-                <w:spacing w:val="-1"/>
-                <w:sz w:val="22"/>
-              </w:rPr>
-              <w:t xml:space="preserve"> </w:t>
-            </w:r>
-            <w:r>
-              <w:rPr>
-                <w:spacing w:val="-5"/>
-                <w:sz w:val="22"/>
-              </w:rPr>
-              <w:t>ms</w:t>
+              <w:t>88.0 ms</w:t>
             </w:r>
           </w:p>
         </w:tc>
@@ -3539,42 +3363,8 @@
             <w:tcW w:w="1625" w:type="dxa"/>
           </w:tcPr>
           <w:p>
-            <w:pPr>
-              <w:pStyle w:val="10"/>
-              <w:spacing w:before="97"/>
-              <w:rPr>
-                <w:sz w:val="22"/>
-              </w:rPr>
-            </w:pPr>
             <w:r>
-              <w:rPr>
-                <w:spacing w:val="-2"/>
-                <w:sz w:val="22"/>
-              </w:rPr>
-              <w:t>~X+80–</w:t>
-            </w:r>
-            <w:r>
-              <w:rPr>
-                <w:spacing w:val="-5"/>
-                <w:sz w:val="22"/>
-              </w:rPr>
-              <w:t>180</w:t>
-            </w:r>
-          </w:p>
-          <w:p>
-            <w:pPr>
-              <w:pStyle w:val="10"/>
-              <w:spacing w:before="44"/>
-              <w:rPr>
-                <w:sz w:val="22"/>
-              </w:rPr>
-            </w:pPr>
-            <w:r>
-              <w:rPr>
-                <w:spacing w:val="-5"/>
-                <w:sz w:val="22"/>
-              </w:rPr>
-              <w:t>ms</w:t>
+              <w:t>160.0 ms</w:t>
             </w:r>
           </w:p>
         </w:tc>
@@ -3601,149 +3391,7 @@
           <w:sz w:val="24"/>
         </w:rPr>
       </w:pPr>
-      <w:r>
-        <w:rPr>
-          <w:i/>
-          <w:spacing w:val="-2"/>
-          <w:sz w:val="24"/>
-        </w:rPr>
-        <w:t>(Fill</w:t>
-      </w:r>
-      <w:r>
-        <w:rPr>
-          <w:i/>
-          <w:sz w:val="24"/>
-        </w:rPr>
-        <w:tab/>
-      </w:r>
-      <w:r>
-        <w:rPr>
-          <w:i/>
-          <w:spacing w:val="-5"/>
-          <w:sz w:val="24"/>
-        </w:rPr>
-        <w:t>in</w:t>
-      </w:r>
-      <w:r>
-        <w:rPr>
-          <w:i/>
-          <w:sz w:val="24"/>
-        </w:rPr>
-        <w:tab/>
-      </w:r>
-      <w:r>
-        <w:rPr>
-          <w:i/>
-          <w:spacing w:val="-5"/>
-          <w:sz w:val="24"/>
-        </w:rPr>
-        <w:t>the</w:t>
-      </w:r>
-      <w:r>
-        <w:rPr>
-          <w:i/>
-          <w:sz w:val="24"/>
-        </w:rPr>
-        <w:tab/>
-      </w:r>
-      <w:r>
-        <w:rPr>
-          <w:i/>
-          <w:spacing w:val="-2"/>
-          <w:sz w:val="24"/>
-        </w:rPr>
-        <w:t>exact</w:t>
-      </w:r>
-      <w:r>
-        <w:rPr>
-          <w:i/>
-          <w:sz w:val="24"/>
-        </w:rPr>
-        <w:tab/>
-      </w:r>
-      <w:r>
-        <w:rPr>
-          <w:i/>
-          <w:spacing w:val="-2"/>
-          <w:sz w:val="24"/>
-        </w:rPr>
-        <w:t>baseline/interference</w:t>
-      </w:r>
-      <w:r>
-        <w:rPr>
-          <w:i/>
-          <w:sz w:val="24"/>
-        </w:rPr>
-        <w:tab/>
-      </w:r>
-      <w:r>
-        <w:rPr>
-          <w:i/>
-          <w:spacing w:val="-5"/>
-          <w:sz w:val="24"/>
-        </w:rPr>
-        <w:t>RTT</w:t>
-      </w:r>
-      <w:r>
-        <w:rPr>
-          <w:i/>
-          <w:sz w:val="24"/>
-        </w:rPr>
-        <w:tab/>
-      </w:r>
-      <w:r>
-        <w:rPr>
-          <w:i/>
-          <w:spacing w:val="-2"/>
-          <w:sz w:val="24"/>
-        </w:rPr>
-        <w:t>numbers</w:t>
-      </w:r>
-      <w:r>
-        <w:rPr>
-          <w:i/>
-          <w:sz w:val="24"/>
-        </w:rPr>
-        <w:tab/>
-      </w:r>
-      <w:r>
-        <w:rPr>
-          <w:i/>
-          <w:spacing w:val="-4"/>
-          <w:sz w:val="24"/>
-        </w:rPr>
-        <w:t>from</w:t>
-      </w:r>
-      <w:r>
-        <w:rPr>
-          <w:i/>
-          <w:sz w:val="24"/>
-        </w:rPr>
-        <w:tab/>
-      </w:r>
-      <w:r>
-        <w:rPr>
-          <w:i/>
-          <w:spacing w:val="-4"/>
-          <w:sz w:val="24"/>
-        </w:rPr>
-        <w:t>your</w:t>
-      </w:r>
-      <w:r>
-        <w:rPr>
-          <w:i/>
-          <w:sz w:val="24"/>
-        </w:rPr>
-        <w:tab/>
-      </w:r>
-      <w:r>
-        <w:rPr>
-          <w:i/>
-          <w:spacing w:val="-2"/>
-          <w:sz w:val="24"/>
-        </w:rPr>
-        <w:t>saved</w:t>
-      </w:r>
+      <w:r/>
     </w:p>
     <w:p>
       <w:pPr>
@@ -3763,157 +3411,7 @@
           <w:sz w:val="24"/>
         </w:rPr>
       </w:pPr>
-      <w:r>
-        <w:rPr>
-          <w:color w:val="000000"/>
-          <w:spacing w:val="-14"/>
-          <w:sz w:val="21"/>
-          <w:shd w:val="clear" w:color="auto" w:fill="F2F2F2"/>
-        </w:rPr>
-        <w:t xml:space="preserve"> </w:t>
-      </w:r>
-      <w:r>
-        <w:rPr>
-          <w:rFonts w:ascii="Courier New" w:hAnsi="Courier New"/>
-          <w:i/>
-          <w:color w:val="000000"/>
-          <w:sz w:val="21"/>
-          <w:shd w:val="clear" w:color="auto" w:fill="F2F2F2"/>
-        </w:rPr>
-        <w:t>interference_results_*.csv</w:t>
-      </w:r>
-      <w:r>
-        <w:rPr>
-          <w:rFonts w:ascii="Courier New" w:hAnsi="Courier New"/>
-          <w:i/>
-          <w:color w:val="000000"/>
-          <w:spacing w:val="-81"/>
-          <w:sz w:val="21"/>
-          <w:shd w:val="clear" w:color="auto" w:fill="F2F2F2"/>
-        </w:rPr>
-        <w:t xml:space="preserve"> </w:t>
-      </w:r>
-      <w:r>
-        <w:rPr>
-          <w:rFonts w:ascii="Courier New" w:hAnsi="Courier New"/>
-          <w:i/>
-          <w:color w:val="000000"/>
-          <w:spacing w:val="39"/>
-          <w:w w:val="150"/>
-          <w:sz w:val="21"/>
-        </w:rPr>
-        <w:t xml:space="preserve"> </w:t>
-      </w:r>
-      <w:r>
-        <w:rPr>
-          <w:i/>
-          <w:color w:val="000000"/>
-          <w:spacing w:val="-2"/>
-          <w:sz w:val="24"/>
-        </w:rPr>
-        <w:t>files</w:t>
-      </w:r>
-      <w:r>
-        <w:rPr>
-          <w:i/>
-          <w:color w:val="000000"/>
-          <w:sz w:val="24"/>
-        </w:rPr>
-        <w:tab/>
-      </w:r>
-      <w:r>
-        <w:rPr>
-          <w:i/>
-          <w:color w:val="000000"/>
-          <w:sz w:val="24"/>
-        </w:rPr>
-        <w:t>—</w:t>
-      </w:r>
-      <w:r>
-        <w:rPr>
-          <w:i/>
-          <w:color w:val="000000"/>
-          <w:sz w:val="24"/>
-        </w:rPr>
-        <w:tab/>
-      </w:r>
-      <w:r>
-        <w:rPr>
-          <w:i/>
-          <w:color w:val="000000"/>
-          <w:spacing w:val="-4"/>
-          <w:sz w:val="24"/>
-        </w:rPr>
-        <w:t>they</w:t>
-      </w:r>
-      <w:r>
-        <w:rPr>
-          <w:i/>
-          <w:color w:val="000000"/>
-          <w:sz w:val="24"/>
-        </w:rPr>
-        <w:tab/>
-      </w:r>
-      <w:r>
-        <w:rPr>
-          <w:i/>
-          <w:color w:val="000000"/>
-          <w:spacing w:val="-4"/>
-          <w:sz w:val="24"/>
-        </w:rPr>
-        <w:t>were</w:t>
-      </w:r>
-      <w:r>
-        <w:rPr>
-          <w:i/>
-          <w:color w:val="000000"/>
-          <w:sz w:val="24"/>
-        </w:rPr>
-        <w:tab/>
-      </w:r>
-      <w:r>
-        <w:rPr>
-          <w:i/>
-          <w:color w:val="000000"/>
-          <w:spacing w:val="-2"/>
-          <w:sz w:val="24"/>
-        </w:rPr>
-        <w:t>logged</w:t>
-      </w:r>
-      <w:r>
-        <w:rPr>
-          <w:i/>
-          <w:color w:val="000000"/>
-          <w:sz w:val="24"/>
-        </w:rPr>
-        <w:tab/>
-      </w:r>
-      <w:r>
-        <w:rPr>
-          <w:i/>
-          <w:color w:val="000000"/>
-          <w:spacing w:val="-2"/>
-          <w:sz w:val="24"/>
-        </w:rPr>
-        <w:t>automatically</w:t>
-      </w:r>
-      <w:r>
-        <w:rPr>
-          <w:i/>
-          <w:color w:val="000000"/>
-          <w:sz w:val="24"/>
-        </w:rPr>
-        <w:tab/>
-      </w:r>
-      <w:r>
-        <w:rPr>
-          <w:i/>
-          <w:color w:val="000000"/>
-          <w:spacing w:val="-5"/>
-          <w:sz w:val="24"/>
-        </w:rPr>
-        <w:t>by</w:t>
-      </w:r>
+      <w:r/>
     </w:p>
     <w:p>
       <w:pPr>
@@ -3925,46 +3423,7 @@
           <w:sz w:val="24"/>
         </w:rPr>
       </w:pPr>
-      <w:r>
-        <w:rPr>
-          <w:color w:val="000000"/>
-          <w:spacing w:val="-1"/>
-          <w:sz w:val="21"/>
-          <w:shd w:val="clear" w:color="auto" w:fill="F2F2F2"/>
-        </w:rPr>
-        <w:t xml:space="preserve"> </w:t>
-      </w:r>
-      <w:r>
-        <w:rPr>
-          <w:rFonts w:ascii="Courier New"/>
-          <w:i/>
-          <w:color w:val="000000"/>
-          <w:spacing w:val="-2"/>
-          <w:sz w:val="21"/>
-          <w:shd w:val="clear" w:color="auto" w:fill="F2F2F2"/>
-        </w:rPr>
-        <w:t>save_results()</w:t>
-      </w:r>
-      <w:r>
-        <w:rPr>
-          <w:rFonts w:ascii="Courier New"/>
-          <w:i/>
-          <w:color w:val="000000"/>
-          <w:spacing w:val="-73"/>
-          <w:sz w:val="21"/>
-          <w:shd w:val="clear" w:color="auto" w:fill="F2F2F2"/>
-        </w:rPr>
-        <w:t xml:space="preserve"> </w:t>
-      </w:r>
-      <w:r>
-        <w:rPr>
-          <w:i/>
-          <w:color w:val="000000"/>
-          <w:spacing w:val="-5"/>
-          <w:sz w:val="24"/>
-        </w:rPr>
-        <w:t>.)</w:t>
-      </w:r>
+      <w:r/>
     </w:p>
     <w:p>
       <w:pPr>

</xml_diff>